<commit_message>
feat(bridge-km19): cai cach toan dien ho so ky thuat & dong bo he sinh thai tien do 23HG Schedule Assistant Pro
- Tach biet triet de Tru T1 va T2; Chuan hoa be mong 11.6x8.0x2.0m Zero-vat (184.243 m3/be)
- Than tru T1 (H=23.35m, 234.922 m3) va T2 (H=25.45m, 266.791 m3) 3 dot than co vat 4 canh
- Xa mu tru T1 (128.851 m3) va T2 (145.026 m3, Duong gang GANG)
- Dong bo 100% he sinh thai 9 Sheet nghiep vu Master 23HG Schedule Assistant Pro (v4.1.0-PRO)
- Mang CPM 37 cong tac tu dong (01/10/2026 - 11/03/2027, lich 6 ngay/tuan, Tet Dinh Mui 8 ngay)
- Lien ket cheo dong 100% cong thuc song: BoQ -> CPM -> EVM 5D -> XMTB -> Giai ngan -> QLCL
- Xuat cau noi chuan quoc te MSPDI XML va cap nhat ban ve chi tiet tru T1, T2
</commit_message>
<xml_diff>
--- a/examples/HO_SO_CAU_KM19_529/01_HIEN_TRUONG_QLCL_KCS/Ho_So_Bien_Ban_Nghiem_Thu_KCS_Cau_Km19+529.080.docx
+++ b/examples/HO_SO_CAU_KM19_529/01_HIEN_TRUONG_QLCL_KCS/Ho_So_Bien_Ban_Nghiem_Thu_KCS_Cau_Km19+529.080.docx
@@ -7212,161 +7212,34 @@
         <w:spacing w:line="276" w:lineRule="auto"/>
       </w:pPr>
       <w:r>
-        <w:rPr>
-          <w:rFonts w:ascii="Times New Roman" w:hAnsi="Times New Roman"/>
-          <w:b/>
-          <w:sz w:val="19"/>
-        </w:rPr>
-        <w:t xml:space="preserve">1. Hạng mục công việc nghiệm thu: </w:t>
-      </w:r>
-      <w:r>
-        <w:rPr>
-          <w:rFonts w:ascii="Times New Roman" w:hAnsi="Times New Roman"/>
-          <w:b w:val="0"/>
-          <w:sz w:val="19"/>
-        </w:rPr>
-        <w:t>Cốt thép, ván khuôn &amp; đổ bê tông bệ móng mố M1, M2 &amp; bệ trụ T1, T2 C30</w:t>
-        <w:br/>
-      </w:r>
-      <w:r>
-        <w:rPr>
-          <w:rFonts w:ascii="Times New Roman" w:hAnsi="Times New Roman"/>
-          <w:b/>
-          <w:sz w:val="19"/>
-        </w:rPr>
-        <w:t xml:space="preserve">2. Vị trí xây dựng: </w:t>
-      </w:r>
-      <w:r>
-        <w:rPr>
-          <w:rFonts w:ascii="Times New Roman" w:hAnsi="Times New Roman"/>
-          <w:b w:val="0"/>
-          <w:sz w:val="19"/>
-        </w:rPr>
-        <w:t>Cầu Km19+529.080 (Phân đoạn Km19+120 -:- Km27+480) - Cao tốc Tuyên Quang - Hà Giang</w:t>
-        <w:br/>
-      </w:r>
-      <w:r>
-        <w:rPr>
-          <w:rFonts w:ascii="Times New Roman" w:hAnsi="Times New Roman"/>
-          <w:b/>
-          <w:sz w:val="19"/>
-        </w:rPr>
-        <w:t xml:space="preserve">3. Thời gian nghiệm thu: </w:t>
-      </w:r>
-      <w:r>
-        <w:rPr>
-          <w:rFonts w:ascii="Times New Roman" w:hAnsi="Times New Roman"/>
-          <w:b w:val="0"/>
-          <w:sz w:val="19"/>
-        </w:rPr>
-        <w:t>Bắt đầu: 08 giờ 30 ngày 08/01/2027; Kết thúc: 11 giờ 00 ngày 08/01/2027</w:t>
-        <w:br/>
-      </w:r>
-      <w:r>
-        <w:rPr>
-          <w:rFonts w:ascii="Times New Roman" w:hAnsi="Times New Roman"/>
-          <w:b/>
-          <w:sz w:val="19"/>
-        </w:rPr>
+        <w:t>1. Hạng mục công việc nghiệm thu: Cốt thép, ván khuôn &amp; đổ bê tông bệ móng mố M1, M2 &amp; bệ trụ T1, T2 C30 (Bệ trụ chữ nhật đặc 11.60m x 8.00m x 2.00m - ZERO VÁT BỆ)</w:t>
+        <w:br/>
+        <w:t>2. Vị trí xây dựng: Cầu Km19+529.080 (Phân đoạn Km19+120 -:- Km27+480) - Cao tốc Tuyên Quang - Hà Giang</w:t>
+        <w:br/>
+        <w:t>3. Thời gian nghiệm thu: Bắt đầu: 08 giờ 30 ngày 08/01/2027; Kết thúc: 11 giờ 00 ngày 08/01/2027</w:t>
+        <w:br/>
         <w:t>4. Thành phần tham gia nghiệm thu:</w:t>
         <w:br/>
-      </w:r>
-      <w:r>
-        <w:rPr>
-          <w:rFonts w:ascii="Times New Roman" w:hAnsi="Times New Roman"/>
-          <w:b/>
-          <w:sz w:val="19"/>
-        </w:rPr>
         <w:t xml:space="preserve">   a) Đại diện Tư vấn giám sát (TVGS):</w:t>
         <w:br/>
-      </w:r>
-      <w:r>
-        <w:rPr>
-          <w:rFonts w:ascii="Times New Roman" w:hAnsi="Times New Roman"/>
-          <w:b w:val="0"/>
-          <w:sz w:val="19"/>
-        </w:rPr>
         <w:t xml:space="preserve">      - Ông: Nguyễn Văn Tiệp             - Chức vụ: Kỹ sư Tư vấn Giám sát trưởng</w:t>
         <w:br/>
-      </w:r>
-      <w:r>
-        <w:rPr>
-          <w:rFonts w:ascii="Times New Roman" w:hAnsi="Times New Roman"/>
-          <w:b/>
-          <w:sz w:val="19"/>
-        </w:rPr>
         <w:t xml:space="preserve">   b) Đại diện Nhà thầu thi công xây dựng:</w:t>
         <w:br/>
-      </w:r>
-      <w:r>
-        <w:rPr>
-          <w:rFonts w:ascii="Times New Roman" w:hAnsi="Times New Roman"/>
-          <w:b w:val="0"/>
-          <w:sz w:val="19"/>
-        </w:rPr>
         <w:t xml:space="preserve">      - Ông: Nguyễn Minh Hiếu            - Chức vụ: Chỉ huy trưởng công trường</w:t>
         <w:br/>
-      </w:r>
-      <w:r>
-        <w:rPr>
-          <w:rFonts w:ascii="Times New Roman" w:hAnsi="Times New Roman"/>
-          <w:b w:val="0"/>
-          <w:sz w:val="19"/>
-        </w:rPr>
         <w:t xml:space="preserve">      - Ông: Trần Đức Giang              - Chức vụ: Kỹ sư Quản lý chất lượng (KCS)</w:t>
         <w:br/>
-      </w:r>
-      <w:r>
-        <w:rPr>
-          <w:rFonts w:ascii="Times New Roman" w:hAnsi="Times New Roman"/>
-          <w:b/>
-          <w:sz w:val="19"/>
-        </w:rPr>
         <w:t>5. Đánh giá công việc xây dựng đã thực hiện:</w:t>
         <w:br/>
-      </w:r>
-      <w:r>
-        <w:rPr>
-          <w:rFonts w:ascii="Times New Roman" w:hAnsi="Times New Roman"/>
-          <w:b w:val="0"/>
-          <w:sz w:val="19"/>
-        </w:rPr>
         <w:t xml:space="preserve">   - Tài liệu làm căn cứ nghiệm thu: Hồ sơ TKBVTC được phê duyệt; Tiêu chuẩn kỹ thuật TCVN 11823:2017, TCVN 9395:2012, TCVN 4453:1995; Phiếu kết quả thí nghiệm vật liệu, chứng chỉ CO/CQ hợp chuẩn.</w:t>
         <w:br/>
-      </w:r>
-      <w:r>
-        <w:rPr>
-          <w:rFonts w:ascii="Times New Roman" w:hAnsi="Times New Roman"/>
-          <w:b w:val="0"/>
-          <w:sz w:val="19"/>
-        </w:rPr>
         <w:t xml:space="preserve">   - Điều kiện nghiệm thu chuyển bước: Đã kiểm tra logic chéo đạt yêu cầu so với bước trước (Sau khi đổ BT lót BBNT-11).</w:t>
         <w:br/>
-      </w:r>
-      <w:r>
-        <w:rPr>
-          <w:rFonts w:ascii="Times New Roman" w:hAnsi="Times New Roman"/>
-          <w:b w:val="0"/>
-          <w:sz w:val="19"/>
-        </w:rPr>
         <w:t xml:space="preserve">   - Chất lượng công việc: Kích thước hình học, cao độ, tọa độ tim mốc và chất lượng cấu kiện hoàn toàn phù hợp với hồ sơ thiết kế bản vẽ thi công và quy chuẩn kỹ thuật.</w:t>
         <w:br/>
-      </w:r>
-      <w:r>
-        <w:rPr>
-          <w:rFonts w:ascii="Times New Roman" w:hAnsi="Times New Roman"/>
-          <w:b/>
-          <w:sz w:val="19"/>
-        </w:rPr>
         <w:t>6. Kết luận nghiệm thu:</w:t>
         <w:br/>
-      </w:r>
-      <w:r>
-        <w:rPr>
-          <w:rFonts w:ascii="Times New Roman" w:hAnsi="Times New Roman"/>
-          <w:b w:val="0"/>
-          <w:sz w:val="19"/>
-        </w:rPr>
         <w:t xml:space="preserve">   Đồng ý nghiệm thu công việc xây dựng nêu trên và cho phép nhà thầu tiếp tục triển khai các bước thi công tiếp theo.</w:t>
         <w:br/>
       </w:r>
@@ -7900,161 +7773,34 @@
         <w:spacing w:line="276" w:lineRule="auto"/>
       </w:pPr>
       <w:r>
-        <w:rPr>
-          <w:rFonts w:ascii="Times New Roman" w:hAnsi="Times New Roman"/>
-          <w:b/>
-          <w:sz w:val="19"/>
-        </w:rPr>
-        <w:t xml:space="preserve">1. Hạng mục công việc nghiệm thu: </w:t>
-      </w:r>
-      <w:r>
-        <w:rPr>
-          <w:rFonts w:ascii="Times New Roman" w:hAnsi="Times New Roman"/>
-          <w:b w:val="0"/>
-          <w:sz w:val="19"/>
-        </w:rPr>
-        <w:t>Thi công thân đặc trụ T1, T2 (H=14.5m &amp; 11.4m) bê tông C30</w:t>
-        <w:br/>
-      </w:r>
-      <w:r>
-        <w:rPr>
-          <w:rFonts w:ascii="Times New Roman" w:hAnsi="Times New Roman"/>
-          <w:b/>
-          <w:sz w:val="19"/>
-        </w:rPr>
-        <w:t xml:space="preserve">2. Vị trí xây dựng: </w:t>
-      </w:r>
-      <w:r>
-        <w:rPr>
-          <w:rFonts w:ascii="Times New Roman" w:hAnsi="Times New Roman"/>
-          <w:b w:val="0"/>
-          <w:sz w:val="19"/>
-        </w:rPr>
-        <w:t>Cầu Km19+529.080 (Phân đoạn Km19+120 -:- Km27+480) - Cao tốc Tuyên Quang - Hà Giang</w:t>
-        <w:br/>
-      </w:r>
-      <w:r>
-        <w:rPr>
-          <w:rFonts w:ascii="Times New Roman" w:hAnsi="Times New Roman"/>
-          <w:b/>
-          <w:sz w:val="19"/>
-        </w:rPr>
-        <w:t xml:space="preserve">3. Thời gian nghiệm thu: </w:t>
-      </w:r>
-      <w:r>
-        <w:rPr>
-          <w:rFonts w:ascii="Times New Roman" w:hAnsi="Times New Roman"/>
-          <w:b w:val="0"/>
-          <w:sz w:val="19"/>
-        </w:rPr>
-        <w:t>Bắt đầu: 08 giờ 30 ngày 22/01/2027; Kết thúc: 11 giờ 00 ngày 22/01/2027</w:t>
-        <w:br/>
-      </w:r>
-      <w:r>
-        <w:rPr>
-          <w:rFonts w:ascii="Times New Roman" w:hAnsi="Times New Roman"/>
-          <w:b/>
-          <w:sz w:val="19"/>
-        </w:rPr>
+        <w:t>1. Hạng mục công việc nghiệm thu: Thi công thân trụ T1, T2 bê tông C30 (Phân tầng 3 Đốt thi công &amp; 2 Đoạn vát: T1 cao 23.35m, T2 cao 25.45m loe sâu)</w:t>
+        <w:br/>
+        <w:t>2. Vị trí xây dựng: Cầu Km19+529.080 (Phân đoạn Km19+120 -:- Km27+480) - Cao tốc Tuyên Quang - Hà Giang</w:t>
+        <w:br/>
+        <w:t>3. Thời gian nghiệm thu: Bắt đầu: 08 giờ 30 ngày 22/01/2027; Kết thúc: 11 giờ 00 ngày 22/01/2027</w:t>
+        <w:br/>
         <w:t>4. Thành phần tham gia nghiệm thu:</w:t>
         <w:br/>
-      </w:r>
-      <w:r>
-        <w:rPr>
-          <w:rFonts w:ascii="Times New Roman" w:hAnsi="Times New Roman"/>
-          <w:b/>
-          <w:sz w:val="19"/>
-        </w:rPr>
         <w:t xml:space="preserve">   a) Đại diện Tư vấn giám sát (TVGS):</w:t>
         <w:br/>
-      </w:r>
-      <w:r>
-        <w:rPr>
-          <w:rFonts w:ascii="Times New Roman" w:hAnsi="Times New Roman"/>
-          <w:b w:val="0"/>
-          <w:sz w:val="19"/>
-        </w:rPr>
         <w:t xml:space="preserve">      - Ông: Nguyễn Văn Tiệp             - Chức vụ: Kỹ sư Tư vấn Giám sát trưởng</w:t>
         <w:br/>
-      </w:r>
-      <w:r>
-        <w:rPr>
-          <w:rFonts w:ascii="Times New Roman" w:hAnsi="Times New Roman"/>
-          <w:b/>
-          <w:sz w:val="19"/>
-        </w:rPr>
         <w:t xml:space="preserve">   b) Đại diện Nhà thầu thi công xây dựng:</w:t>
         <w:br/>
-      </w:r>
-      <w:r>
-        <w:rPr>
-          <w:rFonts w:ascii="Times New Roman" w:hAnsi="Times New Roman"/>
-          <w:b w:val="0"/>
-          <w:sz w:val="19"/>
-        </w:rPr>
         <w:t xml:space="preserve">      - Ông: Nguyễn Minh Hiếu            - Chức vụ: Chỉ huy trưởng công trường</w:t>
         <w:br/>
-      </w:r>
-      <w:r>
-        <w:rPr>
-          <w:rFonts w:ascii="Times New Roman" w:hAnsi="Times New Roman"/>
-          <w:b w:val="0"/>
-          <w:sz w:val="19"/>
-        </w:rPr>
         <w:t xml:space="preserve">      - Ông: Trần Đức Giang              - Chức vụ: Kỹ sư Quản lý chất lượng (KCS)</w:t>
         <w:br/>
-      </w:r>
-      <w:r>
-        <w:rPr>
-          <w:rFonts w:ascii="Times New Roman" w:hAnsi="Times New Roman"/>
-          <w:b/>
-          <w:sz w:val="19"/>
-        </w:rPr>
         <w:t>5. Đánh giá công việc xây dựng đã thực hiện:</w:t>
         <w:br/>
-      </w:r>
-      <w:r>
-        <w:rPr>
-          <w:rFonts w:ascii="Times New Roman" w:hAnsi="Times New Roman"/>
-          <w:b w:val="0"/>
-          <w:sz w:val="19"/>
-        </w:rPr>
         <w:t xml:space="preserve">   - Tài liệu làm căn cứ nghiệm thu: Hồ sơ TKBVTC được phê duyệt; Tiêu chuẩn kỹ thuật TCVN 11823:2017, TCVN 9395:2012, TCVN 4453:1995; Phiếu kết quả thí nghiệm vật liệu, chứng chỉ CO/CQ hợp chuẩn.</w:t>
         <w:br/>
-      </w:r>
-      <w:r>
-        <w:rPr>
-          <w:rFonts w:ascii="Times New Roman" w:hAnsi="Times New Roman"/>
-          <w:b w:val="0"/>
-          <w:sz w:val="19"/>
-        </w:rPr>
         <w:t xml:space="preserve">   - Điều kiện nghiệm thu chuyển bước: Đã kiểm tra logic chéo đạt yêu cầu so với bước trước (Sau khi bệ trụ đạt R7).</w:t>
         <w:br/>
-      </w:r>
-      <w:r>
-        <w:rPr>
-          <w:rFonts w:ascii="Times New Roman" w:hAnsi="Times New Roman"/>
-          <w:b w:val="0"/>
-          <w:sz w:val="19"/>
-        </w:rPr>
         <w:t xml:space="preserve">   - Chất lượng công việc: Kích thước hình học, cao độ, tọa độ tim mốc và chất lượng cấu kiện hoàn toàn phù hợp với hồ sơ thiết kế bản vẽ thi công và quy chuẩn kỹ thuật.</w:t>
         <w:br/>
-      </w:r>
-      <w:r>
-        <w:rPr>
-          <w:rFonts w:ascii="Times New Roman" w:hAnsi="Times New Roman"/>
-          <w:b/>
-          <w:sz w:val="19"/>
-        </w:rPr>
         <w:t>6. Kết luận nghiệm thu:</w:t>
         <w:br/>
-      </w:r>
-      <w:r>
-        <w:rPr>
-          <w:rFonts w:ascii="Times New Roman" w:hAnsi="Times New Roman"/>
-          <w:b w:val="0"/>
-          <w:sz w:val="19"/>
-        </w:rPr>
         <w:t xml:space="preserve">   Đồng ý nghiệm thu công việc xây dựng nêu trên và cho phép nhà thầu tiếp tục triển khai các bước thi công tiếp theo.</w:t>
         <w:br/>
       </w:r>
@@ -8244,161 +7990,34 @@
         <w:spacing w:line="276" w:lineRule="auto"/>
       </w:pPr>
       <w:r>
-        <w:rPr>
-          <w:rFonts w:ascii="Times New Roman" w:hAnsi="Times New Roman"/>
-          <w:b/>
-          <w:sz w:val="19"/>
-        </w:rPr>
-        <w:t xml:space="preserve">1. Hạng mục công việc nghiệm thu: </w:t>
-      </w:r>
-      <w:r>
-        <w:rPr>
-          <w:rFonts w:ascii="Times New Roman" w:hAnsi="Times New Roman"/>
-          <w:b w:val="0"/>
-          <w:sz w:val="19"/>
-        </w:rPr>
-        <w:t>Cốt thép, ván khuôn &amp; đổ bê tông xà mũ trụ T1, T2, đá kê gối C30</w:t>
-        <w:br/>
-      </w:r>
-      <w:r>
-        <w:rPr>
-          <w:rFonts w:ascii="Times New Roman" w:hAnsi="Times New Roman"/>
-          <w:b/>
-          <w:sz w:val="19"/>
-        </w:rPr>
-        <w:t xml:space="preserve">2. Vị trí xây dựng: </w:t>
-      </w:r>
-      <w:r>
-        <w:rPr>
-          <w:rFonts w:ascii="Times New Roman" w:hAnsi="Times New Roman"/>
-          <w:b w:val="0"/>
-          <w:sz w:val="19"/>
-        </w:rPr>
-        <w:t>Cầu Km19+529.080 (Phân đoạn Km19+120 -:- Km27+480) - Cao tốc Tuyên Quang - Hà Giang</w:t>
-        <w:br/>
-      </w:r>
-      <w:r>
-        <w:rPr>
-          <w:rFonts w:ascii="Times New Roman" w:hAnsi="Times New Roman"/>
-          <w:b/>
-          <w:sz w:val="19"/>
-        </w:rPr>
-        <w:t xml:space="preserve">3. Thời gian nghiệm thu: </w:t>
-      </w:r>
-      <w:r>
-        <w:rPr>
-          <w:rFonts w:ascii="Times New Roman" w:hAnsi="Times New Roman"/>
-          <w:b w:val="0"/>
-          <w:sz w:val="19"/>
-        </w:rPr>
-        <w:t>Bắt đầu: 08 giờ 30 ngày 30/01/2027; Kết thúc: 11 giờ 00 ngày 30/01/2027</w:t>
-        <w:br/>
-      </w:r>
-      <w:r>
-        <w:rPr>
-          <w:rFonts w:ascii="Times New Roman" w:hAnsi="Times New Roman"/>
-          <w:b/>
-          <w:sz w:val="19"/>
-        </w:rPr>
+        <w:t>1. Hạng mục công việc nghiệm thu: Cốt thép, ván khuôn &amp; đổ bê tông xà mũ trụ T1, T2, đá kê gối &amp; khối ụ chống xô dầm Super-T C30</w:t>
+        <w:br/>
+        <w:t>2. Vị trí xây dựng: Cầu Km19+529.080 (Phân đoạn Km19+120 -:- Km27+480) - Cao tốc Tuyên Quang - Hà Giang</w:t>
+        <w:br/>
+        <w:t>3. Thời gian nghiệm thu: Bắt đầu: 08 giờ 30 ngày 30/01/2027; Kết thúc: 11 giờ 00 ngày 30/01/2027</w:t>
+        <w:br/>
         <w:t>4. Thành phần tham gia nghiệm thu:</w:t>
         <w:br/>
-      </w:r>
-      <w:r>
-        <w:rPr>
-          <w:rFonts w:ascii="Times New Roman" w:hAnsi="Times New Roman"/>
-          <w:b/>
-          <w:sz w:val="19"/>
-        </w:rPr>
         <w:t xml:space="preserve">   a) Đại diện Tư vấn giám sát (TVGS):</w:t>
         <w:br/>
-      </w:r>
-      <w:r>
-        <w:rPr>
-          <w:rFonts w:ascii="Times New Roman" w:hAnsi="Times New Roman"/>
-          <w:b w:val="0"/>
-          <w:sz w:val="19"/>
-        </w:rPr>
         <w:t xml:space="preserve">      - Ông: Nguyễn Văn Tiệp             - Chức vụ: Kỹ sư Tư vấn Giám sát trưởng</w:t>
         <w:br/>
-      </w:r>
-      <w:r>
-        <w:rPr>
-          <w:rFonts w:ascii="Times New Roman" w:hAnsi="Times New Roman"/>
-          <w:b/>
-          <w:sz w:val="19"/>
-        </w:rPr>
         <w:t xml:space="preserve">   b) Đại diện Nhà thầu thi công xây dựng:</w:t>
         <w:br/>
-      </w:r>
-      <w:r>
-        <w:rPr>
-          <w:rFonts w:ascii="Times New Roman" w:hAnsi="Times New Roman"/>
-          <w:b w:val="0"/>
-          <w:sz w:val="19"/>
-        </w:rPr>
         <w:t xml:space="preserve">      - Ông: Nguyễn Minh Hiếu            - Chức vụ: Chỉ huy trưởng công trường</w:t>
         <w:br/>
-      </w:r>
-      <w:r>
-        <w:rPr>
-          <w:rFonts w:ascii="Times New Roman" w:hAnsi="Times New Roman"/>
-          <w:b w:val="0"/>
-          <w:sz w:val="19"/>
-        </w:rPr>
         <w:t xml:space="preserve">      - Ông: Trần Đức Giang              - Chức vụ: Kỹ sư Quản lý chất lượng (KCS)</w:t>
         <w:br/>
-      </w:r>
-      <w:r>
-        <w:rPr>
-          <w:rFonts w:ascii="Times New Roman" w:hAnsi="Times New Roman"/>
-          <w:b/>
-          <w:sz w:val="19"/>
-        </w:rPr>
         <w:t>5. Đánh giá công việc xây dựng đã thực hiện:</w:t>
         <w:br/>
-      </w:r>
-      <w:r>
-        <w:rPr>
-          <w:rFonts w:ascii="Times New Roman" w:hAnsi="Times New Roman"/>
-          <w:b w:val="0"/>
-          <w:sz w:val="19"/>
-        </w:rPr>
         <w:t xml:space="preserve">   - Tài liệu làm căn cứ nghiệm thu: Hồ sơ TKBVTC được phê duyệt; Tiêu chuẩn kỹ thuật TCVN 11823:2017, TCVN 9395:2012, TCVN 4453:1995; Phiếu kết quả thí nghiệm vật liệu, chứng chỉ CO/CQ hợp chuẩn.</w:t>
         <w:br/>
-      </w:r>
-      <w:r>
-        <w:rPr>
-          <w:rFonts w:ascii="Times New Roman" w:hAnsi="Times New Roman"/>
-          <w:b w:val="0"/>
-          <w:sz w:val="19"/>
-        </w:rPr>
         <w:t xml:space="preserve">   - Điều kiện nghiệm thu chuyển bước: Đã kiểm tra logic chéo đạt yêu cầu so với bước trước (Sau khi thân trụ đạt R14).</w:t>
         <w:br/>
-      </w:r>
-      <w:r>
-        <w:rPr>
-          <w:rFonts w:ascii="Times New Roman" w:hAnsi="Times New Roman"/>
-          <w:b w:val="0"/>
-          <w:sz w:val="19"/>
-        </w:rPr>
         <w:t xml:space="preserve">   - Chất lượng công việc: Kích thước hình học, cao độ, tọa độ tim mốc và chất lượng cấu kiện hoàn toàn phù hợp với hồ sơ thiết kế bản vẽ thi công và quy chuẩn kỹ thuật.</w:t>
         <w:br/>
-      </w:r>
-      <w:r>
-        <w:rPr>
-          <w:rFonts w:ascii="Times New Roman" w:hAnsi="Times New Roman"/>
-          <w:b/>
-          <w:sz w:val="19"/>
-        </w:rPr>
         <w:t>6. Kết luận nghiệm thu:</w:t>
         <w:br/>
-      </w:r>
-      <w:r>
-        <w:rPr>
-          <w:rFonts w:ascii="Times New Roman" w:hAnsi="Times New Roman"/>
-          <w:b w:val="0"/>
-          <w:sz w:val="19"/>
-        </w:rPr>
         <w:t xml:space="preserve">   Đồng ý nghiệm thu công việc xây dựng nêu trên và cho phép nhà thầu tiếp tục triển khai các bước thi công tiếp theo.</w:t>
         <w:br/>
       </w:r>
@@ -9523,9 +9142,7 @@
       </w:tr>
     </w:tbl>
     <w:p>
-      <w:r>
-        <w:br w:type="page"/>
-      </w:r>
+      <w:r/>
     </w:p>
     <w:tbl>
       <w:tblPr>

</xml_diff>